<commit_message>
Successful tests, first Data
</commit_message>
<xml_diff>
--- a/Konzept - Lagerhaltung.docx
+++ b/Konzept - Lagerhaltung.docx
@@ -1341,6 +1341,602 @@
         <w:t>Tabellarische Konsolenausgabe in Main</w:t>
       </w:r>
     </w:p>
+    <w:p/>
+    <w:p>
+      <w:r>
+        <w:lastRenderedPageBreak/>
+        <w:t>Version 12:</w:t>
+      </w:r>
+    </w:p>
+    <w:p>
+      <w:pPr>
+        <w:pStyle w:val="Listenabsatz"/>
+        <w:numPr>
+          <w:ilvl w:val="0"/>
+          <w:numId w:val="1"/>
+        </w:numPr>
+      </w:pPr>
+      <w:r>
+        <w:t>Polymorphie: Einführung von PokemonCard:</w:t>
+      </w:r>
+    </w:p>
+    <w:p>
+      <w:pPr>
+        <w:pStyle w:val="Listenabsatz"/>
+        <w:numPr>
+          <w:ilvl w:val="1"/>
+          <w:numId w:val="1"/>
+        </w:numPr>
+      </w:pPr>
+      <w:r>
+        <w:t>PokemonCard extends Article nicht gut</w:t>
+      </w:r>
+    </w:p>
+    <w:p>
+      <w:pPr>
+        <w:pStyle w:val="Listenabsatz"/>
+        <w:numPr>
+          <w:ilvl w:val="1"/>
+          <w:numId w:val="1"/>
+        </w:numPr>
+      </w:pPr>
+      <w:r>
+        <w:t>Felder wie minimumStock sinnlos-&gt; Basisklasse zu speziell geschnitten</w:t>
+      </w:r>
+    </w:p>
+    <w:p>
+      <w:pPr>
+        <w:pStyle w:val="Listenabsatz"/>
+        <w:numPr>
+          <w:ilvl w:val="1"/>
+          <w:numId w:val="1"/>
+        </w:numPr>
+      </w:pPr>
+      <w:r>
+        <w:t>-&gt; Abstrakte Oberklasse BaseArticle</w:t>
+      </w:r>
+    </w:p>
+    <w:p>
+      <w:pPr>
+        <w:pStyle w:val="Listenabsatz"/>
+        <w:numPr>
+          <w:ilvl w:val="1"/>
+          <w:numId w:val="1"/>
+        </w:numPr>
+      </w:pPr>
+      <w:r>
+        <w:t>-&gt; Gemeinsame Felder: name, id, price, stock</w:t>
+      </w:r>
+    </w:p>
+    <w:p>
+      <w:pPr>
+        <w:pStyle w:val="Listenabsatz"/>
+        <w:numPr>
+          <w:ilvl w:val="1"/>
+          <w:numId w:val="1"/>
+        </w:numPr>
+      </w:pPr>
+      <w:r>
+        <w:t>-&gt; Gemeinsame Methoden: Getter, increaseStock(), decreaseStock()</w:t>
+      </w:r>
+    </w:p>
+    <w:p>
+      <w:pPr>
+        <w:pStyle w:val="Listenabsatz"/>
+        <w:numPr>
+          <w:ilvl w:val="1"/>
+          <w:numId w:val="1"/>
+        </w:numPr>
+      </w:pPr>
+      <w:r>
+        <w:t>-&gt;Neu: BaseArticle.java, PokemonCard.java und HoloType.java</w:t>
+      </w:r>
+    </w:p>
+    <w:p>
+      <w:pPr>
+        <w:pStyle w:val="Listenabsatz"/>
+        <w:numPr>
+          <w:ilvl w:val="1"/>
+          <w:numId w:val="1"/>
+        </w:numPr>
+      </w:pPr>
+      <w:r>
+        <w:t>-&gt; Anpassung der JUnit Test</w:t>
+      </w:r>
+    </w:p>
+    <w:p>
+      <w:pPr>
+        <w:pStyle w:val="Listenabsatz"/>
+        <w:numPr>
+          <w:ilvl w:val="0"/>
+          <w:numId w:val="1"/>
+        </w:numPr>
+      </w:pPr>
+      <w:r>
+        <w:t>Vererbung sauber eingebaut</w:t>
+      </w:r>
+    </w:p>
+    <w:p>
+      <w:pPr>
+        <w:pStyle w:val="Listenabsatz"/>
+        <w:numPr>
+          <w:ilvl w:val="0"/>
+          <w:numId w:val="1"/>
+        </w:numPr>
+      </w:pPr>
+      <w:r>
+        <w:t>Enums für HoloType und CardCondition</w:t>
+      </w:r>
+    </w:p>
+    <w:p>
+      <w:pPr>
+        <w:pStyle w:val="Listenabsatz"/>
+        <w:numPr>
+          <w:ilvl w:val="0"/>
+          <w:numId w:val="1"/>
+        </w:numPr>
+      </w:pPr>
+      <w:r>
+        <w:t>Polymophes Inventory</w:t>
+      </w:r>
+    </w:p>
+    <w:p>
+      <w:pPr>
+        <w:pStyle w:val="Listenabsatz"/>
+        <w:numPr>
+          <w:ilvl w:val="0"/>
+          <w:numId w:val="1"/>
+        </w:numPr>
+      </w:pPr>
+      <w:r>
+        <w:t>37 grüne Tests</w:t>
+      </w:r>
+    </w:p>
+    <w:p>
+      <w:pPr>
+        <w:pStyle w:val="Listenabsatz"/>
+        <w:numPr>
+          <w:ilvl w:val="0"/>
+          <w:numId w:val="1"/>
+        </w:numPr>
+      </w:pPr>
+      <w:r>
+        <w:t>Sprache, und First Edition hinzugefügt.</w:t>
+      </w:r>
+    </w:p>
+    <w:p/>
+    <w:tbl>
+      <w:tblPr>
+        <w:tblW w:w="5000" w:type="pct"/>
+        <w:tblCellMar>
+          <w:top w:w="15" w:type="dxa"/>
+          <w:left w:w="15" w:type="dxa"/>
+          <w:bottom w:w="15" w:type="dxa"/>
+          <w:right w:w="15" w:type="dxa"/>
+        </w:tblCellMar>
+        <w:tblLook w:val="04A0" w:firstRow="1" w:lastRow="0" w:firstColumn="1" w:lastColumn="0" w:noHBand="0" w:noVBand="1"/>
+      </w:tblPr>
+      <w:tblGrid>
+        <w:gridCol w:w="1329"/>
+        <w:gridCol w:w="3078"/>
+        <w:gridCol w:w="4649"/>
+      </w:tblGrid>
+      <w:tr>
+        <w:trPr>
+          <w:tblHeader/>
+        </w:trPr>
+        <w:tc>
+          <w:tcPr>
+            <w:tcW w:w="0" w:type="auto"/>
+            <w:tcBorders>
+              <w:top w:val="single" w:sz="6" w:space="0" w:color="DDDDDD"/>
+              <w:left w:val="single" w:sz="6" w:space="0" w:color="DDDDDD"/>
+              <w:bottom w:val="single" w:sz="6" w:space="0" w:color="DDDDDD"/>
+              <w:right w:val="single" w:sz="6" w:space="0" w:color="DDDDDD"/>
+            </w:tcBorders>
+            <w:shd w:val="clear" w:color="auto" w:fill="F2F2F2"/>
+            <w:tcMar>
+              <w:top w:w="120" w:type="dxa"/>
+              <w:left w:w="120" w:type="dxa"/>
+              <w:bottom w:w="120" w:type="dxa"/>
+              <w:right w:w="120" w:type="dxa"/>
+            </w:tcMar>
+            <w:vAlign w:val="center"/>
+            <w:hideMark/>
+          </w:tcPr>
+          <w:p>
+            <w:pPr>
+              <w:rPr>
+                <w:b/>
+                <w:bCs/>
+              </w:rPr>
+            </w:pPr>
+            <w:r>
+              <w:rPr>
+                <w:b/>
+                <w:bCs/>
+              </w:rPr>
+              <w:t>Schritt</w:t>
+            </w:r>
+          </w:p>
+        </w:tc>
+        <w:tc>
+          <w:tcPr>
+            <w:tcW w:w="0" w:type="auto"/>
+            <w:tcBorders>
+              <w:top w:val="single" w:sz="6" w:space="0" w:color="DDDDDD"/>
+              <w:left w:val="single" w:sz="6" w:space="0" w:color="DDDDDD"/>
+              <w:bottom w:val="single" w:sz="6" w:space="0" w:color="DDDDDD"/>
+              <w:right w:val="single" w:sz="6" w:space="0" w:color="DDDDDD"/>
+            </w:tcBorders>
+            <w:shd w:val="clear" w:color="auto" w:fill="F2F2F2"/>
+            <w:tcMar>
+              <w:top w:w="120" w:type="dxa"/>
+              <w:left w:w="120" w:type="dxa"/>
+              <w:bottom w:w="120" w:type="dxa"/>
+              <w:right w:w="120" w:type="dxa"/>
+            </w:tcMar>
+            <w:vAlign w:val="center"/>
+            <w:hideMark/>
+          </w:tcPr>
+          <w:p>
+            <w:pPr>
+              <w:rPr>
+                <w:b/>
+                <w:bCs/>
+              </w:rPr>
+            </w:pPr>
+            <w:r>
+              <w:rPr>
+                <w:b/>
+                <w:bCs/>
+              </w:rPr>
+              <w:t>Empfehlung</w:t>
+            </w:r>
+          </w:p>
+        </w:tc>
+        <w:tc>
+          <w:tcPr>
+            <w:tcW w:w="0" w:type="auto"/>
+            <w:tcBorders>
+              <w:top w:val="single" w:sz="6" w:space="0" w:color="DDDDDD"/>
+              <w:left w:val="single" w:sz="6" w:space="0" w:color="DDDDDD"/>
+              <w:bottom w:val="single" w:sz="6" w:space="0" w:color="DDDDDD"/>
+              <w:right w:val="single" w:sz="6" w:space="0" w:color="DDDDDD"/>
+            </w:tcBorders>
+            <w:shd w:val="clear" w:color="auto" w:fill="F2F2F2"/>
+            <w:tcMar>
+              <w:top w:w="120" w:type="dxa"/>
+              <w:left w:w="120" w:type="dxa"/>
+              <w:bottom w:w="120" w:type="dxa"/>
+              <w:right w:w="120" w:type="dxa"/>
+            </w:tcMar>
+            <w:vAlign w:val="center"/>
+            <w:hideMark/>
+          </w:tcPr>
+          <w:p>
+            <w:pPr>
+              <w:rPr>
+                <w:b/>
+                <w:bCs/>
+              </w:rPr>
+            </w:pPr>
+            <w:r>
+              <w:rPr>
+                <w:b/>
+                <w:bCs/>
+              </w:rPr>
+              <w:t>Warum</w:t>
+            </w:r>
+          </w:p>
+        </w:tc>
+      </w:tr>
+      <w:tr>
+        <w:tc>
+          <w:tcPr>
+            <w:tcW w:w="0" w:type="auto"/>
+            <w:tcBorders>
+              <w:top w:val="single" w:sz="6" w:space="0" w:color="DDDDDD"/>
+              <w:left w:val="single" w:sz="6" w:space="0" w:color="DDDDDD"/>
+              <w:bottom w:val="single" w:sz="6" w:space="0" w:color="DDDDDD"/>
+              <w:right w:val="single" w:sz="6" w:space="0" w:color="DDDDDD"/>
+            </w:tcBorders>
+            <w:tcMar>
+              <w:top w:w="120" w:type="dxa"/>
+              <w:left w:w="120" w:type="dxa"/>
+              <w:bottom w:w="120" w:type="dxa"/>
+              <w:right w:w="120" w:type="dxa"/>
+            </w:tcMar>
+            <w:vAlign w:val="center"/>
+            <w:hideMark/>
+          </w:tcPr>
+          <w:p>
+            <w:r>
+              <w:t>Jetzt</w:t>
+            </w:r>
+          </w:p>
+        </w:tc>
+        <w:tc>
+          <w:tcPr>
+            <w:tcW w:w="0" w:type="auto"/>
+            <w:tcBorders>
+              <w:top w:val="single" w:sz="6" w:space="0" w:color="DDDDDD"/>
+              <w:left w:val="single" w:sz="6" w:space="0" w:color="DDDDDD"/>
+              <w:bottom w:val="single" w:sz="6" w:space="0" w:color="DDDDDD"/>
+              <w:right w:val="single" w:sz="6" w:space="0" w:color="DDDDDD"/>
+            </w:tcBorders>
+            <w:tcMar>
+              <w:top w:w="120" w:type="dxa"/>
+              <w:left w:w="120" w:type="dxa"/>
+              <w:bottom w:w="120" w:type="dxa"/>
+              <w:right w:w="120" w:type="dxa"/>
+            </w:tcMar>
+            <w:vAlign w:val="center"/>
+            <w:hideMark/>
+          </w:tcPr>
+          <w:p>
+            <w:r>
+              <w:t>Konsolenprojekt fertig stabilisieren</w:t>
+            </w:r>
+          </w:p>
+        </w:tc>
+        <w:tc>
+          <w:tcPr>
+            <w:tcW w:w="0" w:type="auto"/>
+            <w:tcBorders>
+              <w:top w:val="single" w:sz="6" w:space="0" w:color="DDDDDD"/>
+              <w:left w:val="single" w:sz="6" w:space="0" w:color="DDDDDD"/>
+              <w:bottom w:val="single" w:sz="6" w:space="0" w:color="DDDDDD"/>
+              <w:right w:val="single" w:sz="6" w:space="0" w:color="DDDDDD"/>
+            </w:tcBorders>
+            <w:tcMar>
+              <w:top w:w="120" w:type="dxa"/>
+              <w:left w:w="120" w:type="dxa"/>
+              <w:bottom w:w="120" w:type="dxa"/>
+              <w:right w:w="120" w:type="dxa"/>
+            </w:tcMar>
+            <w:vAlign w:val="center"/>
+            <w:hideMark/>
+          </w:tcPr>
+          <w:p>
+            <w:r>
+              <w:t>Geringe Komplexität, gutes OOP-Lernen</w:t>
+            </w:r>
+          </w:p>
+        </w:tc>
+      </w:tr>
+      <w:tr>
+        <w:tc>
+          <w:tcPr>
+            <w:tcW w:w="0" w:type="auto"/>
+            <w:tcBorders>
+              <w:top w:val="single" w:sz="6" w:space="0" w:color="DDDDDD"/>
+              <w:left w:val="single" w:sz="6" w:space="0" w:color="DDDDDD"/>
+              <w:bottom w:val="single" w:sz="6" w:space="0" w:color="DDDDDD"/>
+              <w:right w:val="single" w:sz="6" w:space="0" w:color="DDDDDD"/>
+            </w:tcBorders>
+            <w:tcMar>
+              <w:top w:w="120" w:type="dxa"/>
+              <w:left w:w="120" w:type="dxa"/>
+              <w:bottom w:w="120" w:type="dxa"/>
+              <w:right w:w="120" w:type="dxa"/>
+            </w:tcMar>
+            <w:vAlign w:val="center"/>
+            <w:hideMark/>
+          </w:tcPr>
+          <w:p>
+            <w:r>
+              <w:t>Danach</w:t>
+            </w:r>
+          </w:p>
+        </w:tc>
+        <w:tc>
+          <w:tcPr>
+            <w:tcW w:w="0" w:type="auto"/>
+            <w:tcBorders>
+              <w:top w:val="single" w:sz="6" w:space="0" w:color="DDDDDD"/>
+              <w:left w:val="single" w:sz="6" w:space="0" w:color="DDDDDD"/>
+              <w:bottom w:val="single" w:sz="6" w:space="0" w:color="DDDDDD"/>
+              <w:right w:val="single" w:sz="6" w:space="0" w:color="DDDDDD"/>
+            </w:tcBorders>
+            <w:tcMar>
+              <w:top w:w="120" w:type="dxa"/>
+              <w:left w:w="120" w:type="dxa"/>
+              <w:bottom w:w="120" w:type="dxa"/>
+              <w:right w:w="120" w:type="dxa"/>
+            </w:tcMar>
+            <w:vAlign w:val="center"/>
+            <w:hideMark/>
+          </w:tcPr>
+          <w:p>
+            <w:r>
+              <w:t>SQLite oder H2 einführen</w:t>
+            </w:r>
+          </w:p>
+        </w:tc>
+        <w:tc>
+          <w:tcPr>
+            <w:tcW w:w="0" w:type="auto"/>
+            <w:tcBorders>
+              <w:top w:val="single" w:sz="6" w:space="0" w:color="DDDDDD"/>
+              <w:left w:val="single" w:sz="6" w:space="0" w:color="DDDDDD"/>
+              <w:bottom w:val="single" w:sz="6" w:space="0" w:color="DDDDDD"/>
+              <w:right w:val="single" w:sz="6" w:space="0" w:color="DDDDDD"/>
+            </w:tcBorders>
+            <w:tcMar>
+              <w:top w:w="120" w:type="dxa"/>
+              <w:left w:w="120" w:type="dxa"/>
+              <w:bottom w:w="120" w:type="dxa"/>
+              <w:right w:w="120" w:type="dxa"/>
+            </w:tcMar>
+            <w:vAlign w:val="center"/>
+            <w:hideMark/>
+          </w:tcPr>
+          <w:p>
+            <w:r>
+              <w:t>Einfacher Datenbank-Einstieg ohne Server builder.ai2sql+1</w:t>
+            </w:r>
+          </w:p>
+        </w:tc>
+      </w:tr>
+      <w:tr>
+        <w:tc>
+          <w:tcPr>
+            <w:tcW w:w="0" w:type="auto"/>
+            <w:tcBorders>
+              <w:top w:val="single" w:sz="6" w:space="0" w:color="DDDDDD"/>
+              <w:left w:val="single" w:sz="6" w:space="0" w:color="DDDDDD"/>
+              <w:bottom w:val="single" w:sz="6" w:space="0" w:color="DDDDDD"/>
+              <w:right w:val="single" w:sz="6" w:space="0" w:color="DDDDDD"/>
+            </w:tcBorders>
+            <w:tcMar>
+              <w:top w:w="120" w:type="dxa"/>
+              <w:left w:w="120" w:type="dxa"/>
+              <w:bottom w:w="120" w:type="dxa"/>
+              <w:right w:w="120" w:type="dxa"/>
+            </w:tcMar>
+            <w:vAlign w:val="center"/>
+            <w:hideMark/>
+          </w:tcPr>
+          <w:p>
+            <w:r>
+              <w:t>Später</w:t>
+            </w:r>
+          </w:p>
+        </w:tc>
+        <w:tc>
+          <w:tcPr>
+            <w:tcW w:w="0" w:type="auto"/>
+            <w:tcBorders>
+              <w:top w:val="single" w:sz="6" w:space="0" w:color="DDDDDD"/>
+              <w:left w:val="single" w:sz="6" w:space="0" w:color="DDDDDD"/>
+              <w:bottom w:val="single" w:sz="6" w:space="0" w:color="DDDDDD"/>
+              <w:right w:val="single" w:sz="6" w:space="0" w:color="DDDDDD"/>
+            </w:tcBorders>
+            <w:tcMar>
+              <w:top w:w="120" w:type="dxa"/>
+              <w:left w:w="120" w:type="dxa"/>
+              <w:bottom w:w="120" w:type="dxa"/>
+              <w:right w:w="120" w:type="dxa"/>
+            </w:tcMar>
+            <w:vAlign w:val="center"/>
+            <w:hideMark/>
+          </w:tcPr>
+          <w:p>
+            <w:r>
+              <w:t>Spring Boot REST API</w:t>
+            </w:r>
+          </w:p>
+        </w:tc>
+        <w:tc>
+          <w:tcPr>
+            <w:tcW w:w="0" w:type="auto"/>
+            <w:tcBorders>
+              <w:top w:val="single" w:sz="6" w:space="0" w:color="DDDDDD"/>
+              <w:left w:val="single" w:sz="6" w:space="0" w:color="DDDDDD"/>
+              <w:bottom w:val="single" w:sz="6" w:space="0" w:color="DDDDDD"/>
+              <w:right w:val="single" w:sz="6" w:space="0" w:color="DDDDDD"/>
+            </w:tcBorders>
+            <w:tcMar>
+              <w:top w:w="120" w:type="dxa"/>
+              <w:left w:w="120" w:type="dxa"/>
+              <w:bottom w:w="120" w:type="dxa"/>
+              <w:right w:w="120" w:type="dxa"/>
+            </w:tcMar>
+            <w:vAlign w:val="center"/>
+            <w:hideMark/>
+          </w:tcPr>
+          <w:p>
+            <w:r>
+              <w:t xml:space="preserve">Sauberer Übergang von Konsole zu Backend </w:t>
+            </w:r>
+            <w:hyperlink r:id="rId7" w:tgtFrame="_blank" w:history="1">
+              <w:r>
+                <w:rPr>
+                  <w:rStyle w:val="Hyperlink"/>
+                </w:rPr>
+                <w:t>baeldung</w:t>
+              </w:r>
+            </w:hyperlink>
+          </w:p>
+        </w:tc>
+      </w:tr>
+      <w:tr>
+        <w:tc>
+          <w:tcPr>
+            <w:tcW w:w="0" w:type="auto"/>
+            <w:tcBorders>
+              <w:top w:val="single" w:sz="6" w:space="0" w:color="DDDDDD"/>
+              <w:left w:val="single" w:sz="6" w:space="0" w:color="DDDDDD"/>
+              <w:bottom w:val="single" w:sz="6" w:space="0" w:color="DDDDDD"/>
+              <w:right w:val="single" w:sz="6" w:space="0" w:color="DDDDDD"/>
+            </w:tcBorders>
+            <w:tcMar>
+              <w:top w:w="120" w:type="dxa"/>
+              <w:left w:w="120" w:type="dxa"/>
+              <w:bottom w:w="120" w:type="dxa"/>
+              <w:right w:w="120" w:type="dxa"/>
+            </w:tcMar>
+            <w:vAlign w:val="center"/>
+            <w:hideMark/>
+          </w:tcPr>
+          <w:p>
+            <w:r>
+              <w:t>Noch später</w:t>
+            </w:r>
+          </w:p>
+        </w:tc>
+        <w:tc>
+          <w:tcPr>
+            <w:tcW w:w="0" w:type="auto"/>
+            <w:tcBorders>
+              <w:top w:val="single" w:sz="6" w:space="0" w:color="DDDDDD"/>
+              <w:left w:val="single" w:sz="6" w:space="0" w:color="DDDDDD"/>
+              <w:bottom w:val="single" w:sz="6" w:space="0" w:color="DDDDDD"/>
+              <w:right w:val="single" w:sz="6" w:space="0" w:color="DDDDDD"/>
+            </w:tcBorders>
+            <w:tcMar>
+              <w:top w:w="120" w:type="dxa"/>
+              <w:left w:w="120" w:type="dxa"/>
+              <w:bottom w:w="120" w:type="dxa"/>
+              <w:right w:w="120" w:type="dxa"/>
+            </w:tcMar>
+            <w:vAlign w:val="center"/>
+            <w:hideMark/>
+          </w:tcPr>
+          <w:p>
+            <w:r>
+              <w:t>Angular oder andere Web-UI</w:t>
+            </w:r>
+          </w:p>
+        </w:tc>
+        <w:tc>
+          <w:tcPr>
+            <w:tcW w:w="0" w:type="auto"/>
+            <w:tcBorders>
+              <w:top w:val="single" w:sz="6" w:space="0" w:color="DDDDDD"/>
+              <w:left w:val="single" w:sz="6" w:space="0" w:color="DDDDDD"/>
+              <w:bottom w:val="single" w:sz="6" w:space="0" w:color="DDDDDD"/>
+              <w:right w:val="single" w:sz="6" w:space="0" w:color="DDDDDD"/>
+            </w:tcBorders>
+            <w:tcMar>
+              <w:top w:w="120" w:type="dxa"/>
+              <w:left w:w="120" w:type="dxa"/>
+              <w:bottom w:w="120" w:type="dxa"/>
+              <w:right w:w="120" w:type="dxa"/>
+            </w:tcMar>
+            <w:vAlign w:val="center"/>
+            <w:hideMark/>
+          </w:tcPr>
+          <w:p>
+            <w:r>
+              <w:t>Erst sinnvoll, wenn API und Datenmodell klar sind angular+1</w:t>
+            </w:r>
+          </w:p>
+        </w:tc>
+      </w:tr>
+    </w:tbl>
+    <w:p/>
     <w:sectPr>
       <w:pgSz w:w="11906" w:h="16838"/>
       <w:pgMar w:top="1417" w:right="1417" w:bottom="1134" w:left="1417" w:header="708" w:footer="708" w:gutter="0"/>
@@ -1349,6 +1945,56 @@
     </w:sectPr>
   </w:body>
 </w:document>
+</file>
+
+<file path=word/endnotes.xml><?xml version="1.0" encoding="utf-8"?>
+<w:endnotes xmlns:wpc="http://schemas.microsoft.com/office/word/2010/wordprocessingCanvas" xmlns:cx="http://schemas.microsoft.com/office/drawing/2014/chartex" xmlns:cx1="http://schemas.microsoft.com/office/drawing/2015/9/8/chartex" xmlns:cx2="http://schemas.microsoft.com/office/drawing/2015/10/21/chartex" xmlns:cx3="http://schemas.microsoft.com/office/drawing/2016/5/9/chartex" xmlns:cx4="http://schemas.microsoft.com/office/drawing/2016/5/10/chartex" xmlns:cx5="http://schemas.microsoft.com/office/drawing/2016/5/11/chartex" xmlns:cx6="http://schemas.microsoft.com/office/drawing/2016/5/12/chartex" xmlns:cx7="http://schemas.microsoft.com/office/drawing/2016/5/13/chartex" xmlns:cx8="http://schemas.microsoft.com/office/drawing/2016/5/14/chartex" xmlns:mc="http://schemas.openxmlformats.org/markup-compatibility/2006" xmlns:aink="http://schemas.microsoft.com/office/drawing/2016/ink" xmlns:am3d="http://schemas.microsoft.com/office/drawing/2017/model3d" xmlns:o="urn:schemas-microsoft-com:office:office" xmlns:oel="http://schemas.microsoft.com/office/2019/extlst" xmlns:r="http://schemas.openxmlformats.org/officeDocument/2006/relationships" xmlns:m="http://schemas.openxmlformats.org/officeDocument/2006/math" xmlns:v="urn:schemas-microsoft-com:vml" xmlns:wp14="http://schemas.microsoft.com/office/word/2010/wordprocessingDrawing" xmlns:wp="http://schemas.openxmlformats.org/drawingml/2006/wordprocessingDrawing" xmlns:w10="urn:schemas-microsoft-com:office:word" xmlns:w="http://schemas.openxmlformats.org/wordprocessingml/2006/main" xmlns:w14="http://schemas.microsoft.com/office/word/2010/wordml" xmlns:w15="http://schemas.microsoft.com/office/word/2012/wordml" xmlns:w16cex="http://schemas.microsoft.com/office/word/2018/wordml/cex" xmlns:w16cid="http://schemas.microsoft.com/office/word/2016/wordml/cid" xmlns:w16="http://schemas.microsoft.com/office/word/2018/wordml" xmlns:w16du="http://schemas.microsoft.com/office/word/2023/wordml/word16du" xmlns:w16sdtdh="http://schemas.microsoft.com/office/word/2020/wordml/sdtdatahash" xmlns:w16sdtfl="http://schemas.microsoft.com/office/word/2024/wordml/sdtformatlock" xmlns:w16se="http://schemas.microsoft.com/office/word/2015/wordml/symex" xmlns:wpg="http://schemas.microsoft.com/office/word/2010/wordprocessingGroup" xmlns:wpi="http://schemas.microsoft.com/office/word/2010/wordprocessingInk" xmlns:wne="http://schemas.microsoft.com/office/word/2006/wordml" xmlns:wps="http://schemas.microsoft.com/office/word/2010/wordprocessingShape" mc:Ignorable="w14 w15 w16se w16cid w16 w16cex w16sdtdh w16sdtfl w16du wp14">
+  <w:endnote w:type="separator" w:id="-1">
+    <w:p>
+      <w:pPr>
+        <w:spacing w:after="0" w:line="240" w:lineRule="auto"/>
+      </w:pPr>
+      <w:r>
+        <w:separator/>
+      </w:r>
+    </w:p>
+  </w:endnote>
+  <w:endnote w:type="continuationSeparator" w:id="0">
+    <w:p>
+      <w:pPr>
+        <w:spacing w:after="0" w:line="240" w:lineRule="auto"/>
+      </w:pPr>
+      <w:r>
+        <w:continuationSeparator/>
+      </w:r>
+    </w:p>
+  </w:endnote>
+</w:endnotes>
+</file>
+
+<file path=word/footnotes.xml><?xml version="1.0" encoding="utf-8"?>
+<w:footnotes xmlns:wpc="http://schemas.microsoft.com/office/word/2010/wordprocessingCanvas" xmlns:cx="http://schemas.microsoft.com/office/drawing/2014/chartex" xmlns:cx1="http://schemas.microsoft.com/office/drawing/2015/9/8/chartex" xmlns:cx2="http://schemas.microsoft.com/office/drawing/2015/10/21/chartex" xmlns:cx3="http://schemas.microsoft.com/office/drawing/2016/5/9/chartex" xmlns:cx4="http://schemas.microsoft.com/office/drawing/2016/5/10/chartex" xmlns:cx5="http://schemas.microsoft.com/office/drawing/2016/5/11/chartex" xmlns:cx6="http://schemas.microsoft.com/office/drawing/2016/5/12/chartex" xmlns:cx7="http://schemas.microsoft.com/office/drawing/2016/5/13/chartex" xmlns:cx8="http://schemas.microsoft.com/office/drawing/2016/5/14/chartex" xmlns:mc="http://schemas.openxmlformats.org/markup-compatibility/2006" xmlns:aink="http://schemas.microsoft.com/office/drawing/2016/ink" xmlns:am3d="http://schemas.microsoft.com/office/drawing/2017/model3d" xmlns:o="urn:schemas-microsoft-com:office:office" xmlns:oel="http://schemas.microsoft.com/office/2019/extlst" xmlns:r="http://schemas.openxmlformats.org/officeDocument/2006/relationships" xmlns:m="http://schemas.openxmlformats.org/officeDocument/2006/math" xmlns:v="urn:schemas-microsoft-com:vml" xmlns:wp14="http://schemas.microsoft.com/office/word/2010/wordprocessingDrawing" xmlns:wp="http://schemas.openxmlformats.org/drawingml/2006/wordprocessingDrawing" xmlns:w10="urn:schemas-microsoft-com:office:word" xmlns:w="http://schemas.openxmlformats.org/wordprocessingml/2006/main" xmlns:w14="http://schemas.microsoft.com/office/word/2010/wordml" xmlns:w15="http://schemas.microsoft.com/office/word/2012/wordml" xmlns:w16cex="http://schemas.microsoft.com/office/word/2018/wordml/cex" xmlns:w16cid="http://schemas.microsoft.com/office/word/2016/wordml/cid" xmlns:w16="http://schemas.microsoft.com/office/word/2018/wordml" xmlns:w16du="http://schemas.microsoft.com/office/word/2023/wordml/word16du" xmlns:w16sdtdh="http://schemas.microsoft.com/office/word/2020/wordml/sdtdatahash" xmlns:w16sdtfl="http://schemas.microsoft.com/office/word/2024/wordml/sdtformatlock" xmlns:w16se="http://schemas.microsoft.com/office/word/2015/wordml/symex" xmlns:wpg="http://schemas.microsoft.com/office/word/2010/wordprocessingGroup" xmlns:wpi="http://schemas.microsoft.com/office/word/2010/wordprocessingInk" xmlns:wne="http://schemas.microsoft.com/office/word/2006/wordml" xmlns:wps="http://schemas.microsoft.com/office/word/2010/wordprocessingShape" mc:Ignorable="w14 w15 w16se w16cid w16 w16cex w16sdtdh w16sdtfl w16du wp14">
+  <w:footnote w:type="separator" w:id="-1">
+    <w:p>
+      <w:pPr>
+        <w:spacing w:after="0" w:line="240" w:lineRule="auto"/>
+      </w:pPr>
+      <w:r>
+        <w:separator/>
+      </w:r>
+    </w:p>
+  </w:footnote>
+  <w:footnote w:type="continuationSeparator" w:id="0">
+    <w:p>
+      <w:pPr>
+        <w:spacing w:after="0" w:line="240" w:lineRule="auto"/>
+      </w:pPr>
+      <w:r>
+        <w:continuationSeparator/>
+      </w:r>
+    </w:p>
+  </w:footnote>
+</w:footnotes>
 </file>
 
 <file path=word/numbering.xml><?xml version="1.0" encoding="utf-8"?>
@@ -2539,6 +3185,73 @@
       <w:spacing w:val="5"/>
     </w:rPr>
   </w:style>
+  <w:style w:type="paragraph" w:styleId="Kopfzeile">
+    <w:name w:val="header"/>
+    <w:basedOn w:val="Standard"/>
+    <w:link w:val="KopfzeileZchn"/>
+    <w:uiPriority w:val="99"/>
+    <w:unhideWhenUsed/>
+    <w:rsid w:val="003862FF"/>
+    <w:pPr>
+      <w:tabs>
+        <w:tab w:val="center" w:pos="4536"/>
+        <w:tab w:val="right" w:pos="9072"/>
+      </w:tabs>
+      <w:spacing w:after="0" w:line="240" w:lineRule="auto"/>
+    </w:pPr>
+  </w:style>
+  <w:style w:type="character" w:customStyle="1" w:styleId="KopfzeileZchn">
+    <w:name w:val="Kopfzeile Zchn"/>
+    <w:basedOn w:val="Absatz-Standardschriftart"/>
+    <w:link w:val="Kopfzeile"/>
+    <w:uiPriority w:val="99"/>
+    <w:rsid w:val="003862FF"/>
+  </w:style>
+  <w:style w:type="paragraph" w:styleId="Fuzeile">
+    <w:name w:val="footer"/>
+    <w:basedOn w:val="Standard"/>
+    <w:link w:val="FuzeileZchn"/>
+    <w:uiPriority w:val="99"/>
+    <w:unhideWhenUsed/>
+    <w:rsid w:val="003862FF"/>
+    <w:pPr>
+      <w:tabs>
+        <w:tab w:val="center" w:pos="4536"/>
+        <w:tab w:val="right" w:pos="9072"/>
+      </w:tabs>
+      <w:spacing w:after="0" w:line="240" w:lineRule="auto"/>
+    </w:pPr>
+  </w:style>
+  <w:style w:type="character" w:customStyle="1" w:styleId="FuzeileZchn">
+    <w:name w:val="Fußzeile Zchn"/>
+    <w:basedOn w:val="Absatz-Standardschriftart"/>
+    <w:link w:val="Fuzeile"/>
+    <w:uiPriority w:val="99"/>
+    <w:rsid w:val="003862FF"/>
+  </w:style>
+  <w:style w:type="character" w:styleId="Hyperlink">
+    <w:name w:val="Hyperlink"/>
+    <w:basedOn w:val="Absatz-Standardschriftart"/>
+    <w:uiPriority w:val="99"/>
+    <w:unhideWhenUsed/>
+    <w:rsid w:val="001D759D"/>
+    <w:rPr>
+      <w:color w:val="467886" w:themeColor="hyperlink"/>
+      <w:u w:val="single"/>
+    </w:rPr>
+  </w:style>
+  <w:style w:type="character" w:styleId="NichtaufgelsteErwhnung">
+    <w:name w:val="Unresolved Mention"/>
+    <w:basedOn w:val="Absatz-Standardschriftart"/>
+    <w:uiPriority w:val="99"/>
+    <w:semiHidden/>
+    <w:unhideWhenUsed/>
+    <w:rsid w:val="001D759D"/>
+    <w:rPr>
+      <w:color w:val="605E5C"/>
+      <w:shd w:val="clear" w:color="auto" w:fill="E1DFDD"/>
+    </w:rPr>
+  </w:style>
 </w:styles>
 </file>
 

</xml_diff>